<commit_message>
Confirm unique-paper frame and protect reproducible preparation outputs
Co-Authored-By: Tatsuki Onishi <bougtoir@gmail.com>
</commit_message>
<xml_diff>
--- a/paper2_reconstruction/manuscript/Preparation_draft_EN.docx
+++ b/paper2_reconstruction/manuscript/Preparation_draft_EN.docx
@@ -40,7 +40,7 @@
     </w:p>
     <w:p>
       <w:r>
-        <w:t>Access to research artifacts does not establish whether the published scientific description supports an independent implementation. This prospective study will estimate publication-grounded computational reconstructability under a specified agent, information boundary and resource budget, without consulting the original implementation or purchasing study-specific commercial software. The source audit identified 10,000 deposited records representing 9,935 distinct PMIDs, requiring an explicit paper-level frame decision. Existing software and availability variables are retained as historical text detections rather than validated access assessments. The proposed design separates eligibility, input and resource access, specification, implementation, execution, numerical agreement and target-linked conclusion preservation. Three fixed independent run slots per sampled paper will support majority, strict and permissive outcome definitions while retaining missing or contaminated slots as unresolved. Targets, tolerances and resource ceilings must be frozen prospectively. This document contains only preparation findings and proposed methods. No pilot, reconstruction experiment, human validation or descriptive original-code reveal has been completed. No reconstructability rate or empirical conclusion is available. A qualified information firewall, verified study inputs and real validation remain necessary before this work can support a completed-study submission.</w:t>
+        <w:t>Access to research artifacts does not establish whether the published scientific description supports an independent implementation. This prospective study will estimate publication-grounded computational reconstructability under a specified agent, information boundary and resource budget, without consulting the original implementation or purchasing study-specific commercial software. The source audit identified 10,000 deposited records representing 9,935 distinct PMIDs. The author approved the unique-PMID frame while preserving every deposited row. Existing variables remain historical text detections rather than validated access assessments. The proposed design separates eligibility, input and resource access, specification, implementation, execution, numerical agreement and target-linked conclusion preservation. Three fixed independent run slots per sampled paper will support majority, strict and permissive outcome definitions while retaining missing or contaminated slots as unresolved. Targets, tolerances and resource ceilings must be frozen prospectively. This document contains only preparation findings and proposed methods. No pilot, reconstruction experiment, human validation or descriptive original-code reveal has been completed. No reconstructability rate or empirical conclusion is available. A qualified information firewall, verified study inputs and real validation remain necessary before this work can support a completed-study submission.</w:t>
       </w:r>
     </w:p>
     <w:p>
@@ -158,7 +158,7 @@
     </w:p>
     <w:p>
       <w:r>
-        <w:t>After source resolution, a diverse pilot will finalize operational rules. The main sample is approximately 100 papers, stratified using a deterministic disjoint assignment of the seven overlapping EPJ fields. Save within-field sampling probabilities and weights. Before each run, select one central target by the frozen hierarchy and encode its associated claim. No outcome-informed target replacement is permitted. Planning precision in the supplement is not empirical evidence.</w:t>
+        <w:t>Using the approved frame, a diverse pilot will finalize operational rules. The main sample is approximately 100 papers, stratified using a deterministic disjoint assignment of the seven overlapping EPJ fields. Save within-field sampling probabilities and weights. Before each run, select one central target by the frozen hierarchy and encode its associated claim. No outcome-informed target replacement is permitted. Planning precision in the supplement is not empirical evidence.</w:t>
       </w:r>
     </w:p>
     <w:p>
@@ -670,7 +670,7 @@
     </w:p>
     <w:p>
       <w:r>
-        <w:t>Submission is on hold for source-frame resolution, qualification of an enforced information firewall, pilot and prospective freeze, actual classification and reconstruction evidence, and human-validation status. This document must not be submitted as a completed empirical study or presented as a frozen protocol.</w:t>
+        <w:t>Submission is on hold for qualification of an enforced information firewall, pilot and prospective freeze, actual classification and reconstruction evidence, and human-validation status. This document must not be submitted as a completed empirical study or presented as a frozen protocol.</w:t>
       </w:r>
     </w:p>
     <w:p>

</xml_diff>

<commit_message>
Main study: delegated primary adjudication, descriptive reveal ledger and prespecified SAP analysis (AMEND-2026-09-25-07)
Co-Authored-By: Tatsuki Onishi <bougtoir@gmail.com>
</commit_message>
<xml_diff>
--- a/paper2_reconstruction/manuscript/Preparation_draft_EN.docx
+++ b/paper2_reconstruction/manuscript/Preparation_draft_EN.docx
@@ -652,7 +652,7 @@
     </w:tbl>
     <w:p>
       <w:r>
-        <w:t>The original sampling code caps annual candidate retrieval and its nominal random-offset expression is always zero. Historical candidate/API snapshots and validation annotations were not recovered. Consequently original population-wide selection probabilities and extraction accuracy are not established by this audit. Current availability, eligibility and reconstruction outcomes remain unassessed. No reconstruction rate can be calculated.</w:t>
+        <w:t>The original sampling code caps annual candidate retrieval and its nominal random-offset expression is always zero. Historical candidate/API snapshots and validation annotations were not recovered. Consequently original population-wide selection probabilities and extraction accuracy are not established by this audit. Main-study outcomes below are delegated mechanical adjudications that await human adjudication; no human-validated reconstruction rate exists.</w:t>
       </w:r>
     </w:p>
     <w:p>
@@ -660,7 +660,40 @@
         <w:pStyle w:val="Heading1"/>
       </w:pPr>
       <w:r>
-        <w:t>4 Discussion boundary and submission hold</w:t>
+        <w:t>4 Main-study execution and delegated mechanical results</w:t>
+      </w:r>
+    </w:p>
+    <w:p>
+      <w:r>
+        <w:t>Status: every number in this section is a delegated mechanical adjudication of sealed blind outcomes under frozen rules (AMEND-2026-09-25-07). Human adjudication and investigator verification are pending, and the seven prospective pilot papers and seven ACCESSIBILITY_GATE_FAILED papers are outside every denominator below.</w:t>
+      </w:r>
+    </w:p>
+    <w:p>
+      <w:r>
+        <w:t>Exhaustive route screening of the unique-PMID frame left 461 route-eligible papers, from which 100 were sampled in seven frozen strata. 10 sampled papers completed three blind slots (30 runs); 90 were not run and retain machine-readable states (Table 2): external public reference resource required, delegated G1–G5 negative, required inputs absent from the public listing, specification rejected by the quote/leakage validator, target value not located verbatim, every candidate input leaking the target, or no input retained.</w:t>
+      </w:r>
+    </w:p>
+    <w:p>
+      <w:r>
+        <w:t>Among attempted papers the majority endpoint was met by 0 of 10 (secondary conditional rate; Wilson reference 0.00–0.28). Prespecified thresholds — strict: failure 10; majority: failure 10; permissive: failure 9, success 1. Run-level L1–L5 frequencies are in Table 3. Stop reasons: wall_limit 1, tool_limit 16, final_report 10, token_reserve_limit 2, malformed_action_limit 1. Failure codes by run (Table 4): F01 5, F03 2, F13 19, F15 3, F20 2. F13 denotes the frozen resource ceiling, not demonstrated publication inadequacy.</w:t>
+      </w:r>
+    </w:p>
+    <w:p>
+      <w:r>
+        <w:t>Under the frozen SAP the headline policy estimand retains non-attempted papers as policy non-success. Taking the delegated states as recorded, the simultaneous hypergeometric upper bound on the eligible-population success rate is 0.262 (weighted point estimate 0.000). Because gate verification is pending, an identification envelope that treats every non-attempted paper as unresolved reaches 0.974; it is a bound, not an estimate. No random-intercept model, perturbation, multiverse or alternative-implementation analysis was performed.</w:t>
+      </w:r>
+    </w:p>
+    <w:p>
+      <w:r>
+        <w:t>Descriptive original-code reveal (Table 5) was recorded only after the seal: 3 attempted papers named public code routes or shipped scripts inside the data deposit (withheld from the solver) and are described; 7 named none and receive a missing reveal assessment. Nothing was executed and no blind score was revisited.</w:t>
+      </w:r>
+    </w:p>
+    <w:p>
+      <w:pPr>
+        <w:pStyle w:val="Heading1"/>
+      </w:pPr>
+      <w:r>
+        <w:t>5 Discussion boundary and submission hold</w:t>
       </w:r>
     </w:p>
     <w:p>

</xml_diff>